<commit_message>
import feature and enhancement
</commit_message>
<xml_diff>
--- a/templates/letter-master.docx
+++ b/templates/letter-master.docx
@@ -242,7 +242,20 @@
           <w:szCs w:val="22"/>
           <w:lang w:val="en-US" w:eastAsia="en-US"/>
         </w:rPr>
-        <w:t>PRE-EMPLOYMENT MEDICAL EXAMINATION FOR</w:t>
+        <w:t>PRE-EMPLOYMENT M</w:t>
+      </w:r>
+      <w:bookmarkStart w:id="0" w:name="_GoBack"/>
+      <w:bookmarkEnd w:id="0"/>
+      <w:r>
+        <w:rPr>
+          <w:rFonts w:cs="Arial"/>
+          <w:b/>
+          <w:bCs/>
+          <w:sz w:val="22"/>
+          <w:szCs w:val="22"/>
+          <w:lang w:val="en-US" w:eastAsia="en-US"/>
+        </w:rPr>
+        <w:t>EDICAL EXAMINATION FOR</w:t>
       </w:r>
     </w:p>
     <w:p>
@@ -1209,11 +1222,9 @@
         <w:ind w:left="0"/>
         <w:jc w:val="both"/>
         <w:rPr>
-          <w:rFonts w:hint="default" w:cs="Arial"/>
-          <w:b/>
-          <w:sz w:val="22"/>
-          <w:szCs w:val="22"/>
-          <w:lang w:val="en-US" w:eastAsia="en-US"/>
+          <w:rFonts w:cs="Arial"/>
+          <w:sz w:val="22"/>
+          <w:szCs w:val="22"/>
         </w:rPr>
       </w:pPr>
       <w:r>
@@ -1243,27 +1254,23 @@
         <w:ind w:left="0"/>
         <w:jc w:val="both"/>
         <w:rPr>
-          <w:rFonts w:cs="Arial"/>
-          <w:sz w:val="22"/>
-          <w:szCs w:val="22"/>
-        </w:rPr>
-      </w:pPr>
-    </w:p>
-    <w:p>
-      <w:pPr>
-        <w:pStyle w:val="46"/>
-        <w:spacing w:before="0"/>
-        <w:ind w:left="0"/>
-        <w:jc w:val="both"/>
-        <w:rPr>
-          <w:rFonts w:cs="Arial"/>
+          <w:rFonts w:hint="default" w:cs="Arial"/>
           <w:b/>
           <w:sz w:val="22"/>
           <w:szCs w:val="22"/>
-        </w:rPr>
-      </w:pPr>
-      <w:bookmarkStart w:id="0" w:name="_GoBack"/>
-      <w:bookmarkEnd w:id="0"/>
+          <w:lang w:val="en-US"/>
+        </w:rPr>
+      </w:pPr>
+      <w:r>
+        <w:rPr>
+          <w:rFonts w:hint="default" w:cs="Arial"/>
+          <w:b/>
+          <w:sz w:val="22"/>
+          <w:szCs w:val="22"/>
+          <w:lang w:val="en-US"/>
+        </w:rPr>
+        <w:t>//SIGNATURE</w:t>
+      </w:r>
     </w:p>
     <w:p>
       <w:pPr>
@@ -1338,6 +1345,7 @@
           <w:sz w:val="22"/>
           <w:szCs w:val="22"/>
         </w:rPr>
+        <w:br w:type="page"/>
         <w:t>ATTACHMENT</w:t>
       </w:r>
     </w:p>

</xml_diff>